<commit_message>
Save the Milestone One final files and the pending homework and capstone materials.
Co-authored-by: Cursor <cursoragent@cursor.com>
</commit_message>
<xml_diff>
--- a/milestone1/dx699-weekly-reflection-journal_final.docx
+++ b/milestone1/dx699-weekly-reflection-journal_final.docx
@@ -38,7 +38,15 @@
         <w:jc w:val="center"/>
       </w:pPr>
       <w:r>
-        <w:t>Weeks 2–6  ·  artifacts included</w:t>
+        <w:t>Weeks 2–</w:t>
+      </w:r>
+      <w:proofErr w:type="gramStart"/>
+      <w:r>
+        <w:t>6  ·</w:t>
+      </w:r>
+      <w:proofErr w:type="gramEnd"/>
+      <w:r>
+        <w:t xml:space="preserve">  artifacts included</w:t>
       </w:r>
     </w:p>
     <w:p>
@@ -307,7 +315,15 @@
     </w:p>
     <w:p>
       <w:r>
-        <w:t>Dataset 1 : SPY options, 31 Dec 2024. One listed contract. Near-the-money sample (the file’s first rows are deep in-the-money expiries).</w:t>
+        <w:t xml:space="preserve">Dataset </w:t>
+      </w:r>
+      <w:proofErr w:type="gramStart"/>
+      <w:r>
+        <w:t>1 :</w:t>
+      </w:r>
+      <w:proofErr w:type="gramEnd"/>
+      <w:r>
+        <w:t xml:space="preserve"> SPY options, 31 Dec 2024. One listed contract. Near-the-money sample (the file’s first rows are deep in-the-money expiries).</w:t>
       </w:r>
     </w:p>
     <w:tbl>
@@ -660,7 +676,15 @@
     <w:p/>
     <w:p>
       <w:r>
-        <w:t>Dataset 2 : CPCA China passenger-vehicle sales. One model in one month.</w:t>
+        <w:t xml:space="preserve">Dataset </w:t>
+      </w:r>
+      <w:proofErr w:type="gramStart"/>
+      <w:r>
+        <w:t>2 :</w:t>
+      </w:r>
+      <w:proofErr w:type="gramEnd"/>
+      <w:r>
+        <w:t xml:space="preserve"> CPCA China passenger-vehicle sales. One model in one month.</w:t>
       </w:r>
     </w:p>
     <w:tbl>
@@ -1013,7 +1037,15 @@
     <w:p/>
     <w:p>
       <w:r>
-        <w:t>Dataset 3 : Spotify tracks. One track, audio features plus genre.</w:t>
+        <w:t xml:space="preserve">Dataset </w:t>
+      </w:r>
+      <w:proofErr w:type="gramStart"/>
+      <w:r>
+        <w:t>3 :</w:t>
+      </w:r>
+      <w:proofErr w:type="gramEnd"/>
+      <w:r>
+        <w:t xml:space="preserve"> Spotify tracks. One track, audio features plus genre.</w:t>
       </w:r>
     </w:p>
     <w:tbl>
@@ -1293,8 +1325,16 @@
               <w:rPr>
                 <w:sz w:val="20"/>
               </w:rPr>
-              <w:t>Ingrid Michaelson;ZAYN</w:t>
-            </w:r>
+              <w:t xml:space="preserve">Ingrid </w:t>
+            </w:r>
+            <w:proofErr w:type="gramStart"/>
+            <w:r>
+              <w:rPr>
+                <w:sz w:val="20"/>
+              </w:rPr>
+              <w:t>Michaelson;ZAYN</w:t>
+            </w:r>
+            <w:proofErr w:type="gramEnd"/>
           </w:p>
         </w:tc>
         <w:tc>
@@ -1366,7 +1406,15 @@
     <w:p/>
     <w:p>
       <w:r>
-        <w:t>Dataset 4 : TMDB movies. One film. Grumpier Old Men shows a zero budget that is missing data, not a free film.</w:t>
+        <w:t xml:space="preserve">Dataset </w:t>
+      </w:r>
+      <w:proofErr w:type="gramStart"/>
+      <w:r>
+        <w:t>4 :</w:t>
+      </w:r>
+      <w:proofErr w:type="gramEnd"/>
+      <w:r>
+        <w:t xml:space="preserve"> TMDB movies. One film. Grumpier Old Men shows a zero budget that is missing data, not a free film.</w:t>
       </w:r>
     </w:p>
     <w:tbl>
@@ -1719,7 +1767,15 @@
     <w:p/>
     <w:p>
       <w:r>
-        <w:t>Dataset 5 : FINRA short interest, 30 Sep 2026. One stock on one settlement date. File: shrt20260930.csv.</w:t>
+        <w:t xml:space="preserve">Dataset </w:t>
+      </w:r>
+      <w:proofErr w:type="gramStart"/>
+      <w:r>
+        <w:t>5 :</w:t>
+      </w:r>
+      <w:proofErr w:type="gramEnd"/>
+      <w:r>
+        <w:t xml:space="preserve"> FINRA short interest, 30 Sep 2026. One stock on one settlement date. File: shrt20260930.csv.</w:t>
       </w:r>
     </w:p>
     <w:tbl>
@@ -1999,6 +2055,7 @@
               <w:rPr>
                 <w:sz w:val="20"/>
               </w:rPr>
+              <w:lastRenderedPageBreak/>
               <w:t>2026-09-30</w:t>
             </w:r>
           </w:p>
@@ -2251,7 +2308,14 @@
               <w:rPr>
                 <w:sz w:val="20"/>
               </w:rPr>
-              <w:t>Agilent Technologies Inc.</w:t>
+              <w:t xml:space="preserve">Agilent Technologies </w:t>
+            </w:r>
+            <w:r>
+              <w:rPr>
+                <w:sz w:val="20"/>
+              </w:rPr>
+              <w:lastRenderedPageBreak/>
+              <w:t>Inc.</w:t>
             </w:r>
           </w:p>
         </w:tc>
@@ -2267,6 +2331,7 @@
               <w:rPr>
                 <w:sz w:val="20"/>
               </w:rPr>
+              <w:lastRenderedPageBreak/>
               <w:t>5,240,309</w:t>
             </w:r>
           </w:p>
@@ -2456,7 +2521,15 @@
     <w:p/>
     <w:p>
       <w:r>
-        <w:t>Reflection: The module treats prediction as supervised segmentation. That is how I started to look at an option chain: boundaries across moneyness and expiry, the way a tree splits customers. After that I cared more about the shape of the problem than about which industry label it wore.</w:t>
+        <w:t xml:space="preserve">Reflection: The module treats prediction as supervised segmentation. That is how I started to look at an option chain: boundaries across moneyness and expiry, the way a tree splits </w:t>
+      </w:r>
+      <w:proofErr w:type="gramStart"/>
+      <w:r>
+        <w:t>customers</w:t>
+      </w:r>
+      <w:proofErr w:type="gramEnd"/>
+      <w:r>
+        <w:t>. After that I cared more about the shape of the problem than about which industry label it wore.</w:t>
       </w:r>
     </w:p>
     <w:p>
@@ -2491,6 +2564,7 @@
         <w:rPr>
           <w:noProof/>
         </w:rPr>
+        <w:lastRenderedPageBreak/>
         <w:drawing>
           <wp:inline distT="0" distB="0" distL="0" distR="0" wp14:anchorId="748D218A" wp14:editId="654C8E90">
             <wp:extent cx="5943600" cy="3343275"/>
@@ -2585,6 +2659,7 @@
         <w:rPr>
           <w:noProof/>
         </w:rPr>
+        <w:lastRenderedPageBreak/>
         <w:drawing>
           <wp:inline distT="0" distB="0" distL="0" distR="0" wp14:anchorId="48939378" wp14:editId="608D4BA4">
             <wp:extent cx="5943600" cy="3343275"/>
@@ -2679,6 +2754,7 @@
         <w:rPr>
           <w:noProof/>
         </w:rPr>
+        <w:lastRenderedPageBreak/>
         <w:drawing>
           <wp:inline distT="0" distB="0" distL="0" distR="0" wp14:anchorId="3126BAEE" wp14:editId="35DE163A">
             <wp:extent cx="5943600" cy="3343275"/>
@@ -2773,6 +2849,7 @@
         <w:rPr>
           <w:noProof/>
         </w:rPr>
+        <w:lastRenderedPageBreak/>
         <w:drawing>
           <wp:inline distT="0" distB="0" distL="0" distR="0" wp14:anchorId="5F1A82E6" wp14:editId="171CA732">
             <wp:extent cx="5943600" cy="3343275"/>
@@ -2867,6 +2944,7 @@
         <w:rPr>
           <w:noProof/>
         </w:rPr>
+        <w:lastRenderedPageBreak/>
         <w:t>Demo in the deck: crowded means days-to-cover above 5, predicted from log volume and market class (n = 19,438 after dropping zero volume). Majority baseline 73.5%. Depth-3 tree 78.2%. Linear discriminant 78.7%. First split is log(ADV) &lt;= 6.20, about 500 shares a day. The crowded class is low-volume OTC names. Liquidity, not a trading signal.</w:t>
       </w:r>
     </w:p>
@@ -3073,7 +3151,21 @@
               <w:rPr>
                 <w:sz w:val="20"/>
               </w:rPr>
-              <w:t>Weak: monthly EV units from lags is a time series; rubric discourages it</w:t>
+              <w:t xml:space="preserve">Weak: monthly EV units from lags </w:t>
+            </w:r>
+            <w:proofErr w:type="gramStart"/>
+            <w:r>
+              <w:rPr>
+                <w:sz w:val="20"/>
+              </w:rPr>
+              <w:t>is</w:t>
+            </w:r>
+            <w:proofErr w:type="gramEnd"/>
+            <w:r>
+              <w:rPr>
+                <w:sz w:val="20"/>
+              </w:rPr>
+              <w:t xml:space="preserve"> a time series; rubric discourages it</w:t>
             </w:r>
           </w:p>
         </w:tc>
@@ -3312,6 +3404,7 @@
     <w:p/>
     <w:p>
       <w:r>
+        <w:lastRenderedPageBreak/>
         <w:t>Reflection: Spotify's label noise was the puzzle I spent the most time on. Same audio features, two genre labels. You cannot classify that without first deciding what a row even is. The other headache was formatting. Double spacing cuts the word count on a page in half.</w:t>
       </w:r>
     </w:p>

</xml_diff>